<commit_message>
Rà soát cuối: sửa 3 lỗi, thêm 5 test, cập nhật Word/PDF
- truoc-khi-cai.sh kiểm đúng thư mục install.sh sẽ cài (không tự nhảy sang /root)
- nap/import: JSON có phần tử không phải ghi chú -> báo lỗi rõ thay vì traceback
- API web: từ chối trường sai kiểu (không còn lưu '{'a': 1}' vào kho), nhận thẻ dạng danh sách
- test brain 92, web 67; Word/PDF dựng lại, 89/89 dòng lệnh khớp bản gốc

Co-Authored-By: Claude Opus 5.5 <noreply@anthropic.com>
Claude-Session: https://claude.ai/code/session_019JVo3BJTj52HG2fFFa7rhH
</commit_message>
<xml_diff>
--- a/OpenClaw-NhomA-Cai-dat-va-Su-dung.docx
+++ b/OpenClaw-NhomA-Cai-dat-va-Su-dung.docx
@@ -6843,7 +6843,7 @@
           <w:szCs w:val="19"/>
           <w:shd w:fill="F1F4F9" w:color="auto" w:val="clear"/>
         </w:rPr>
-        <w:t xml:space="preserve">không tìm thấy workspace của OpenClaw</w:t>
+        <w:t xml:space="preserve">thư mục skills — CHƯA ĐẠT — không thấy workspace OpenClaw ở …</w:t>
       </w:r>
     </w:p>
     <w:p>
@@ -14828,7 +14828,7 @@
           <w:sz w:val="19"/>
           <w:szCs w:val="19"/>
         </w:rPr>
-        <w:t xml:space="preserve">bash test-brain.sh     # 90 trường hợp: phân loại nhóm/loại, chống trùng y hệt, nạp nhiều nguồn, việc, kho rỗng, thẻ tiếng Việt, cất kho/xoá/lấy lại,</w:t>
+        <w:t xml:space="preserve">bash test-brain.sh     # 92 trường hợp: phân loại nhóm/loại, chống trùng y hệt, nạp nhiều nguồn, việc, kho rỗng, thẻ tiếng Việt, cất kho/xoá/lấy lại,</w:t>
       </w:r>
     </w:p>
     <w:p>
@@ -14920,7 +14920,7 @@
           <w:sz w:val="19"/>
           <w:szCs w:val="19"/>
         </w:rPr>
-        <w:t xml:space="preserve">bash test-web.sh       # 64 trường hợp: lõi Bát Quái đúng Kinh Dịch, thư viện, việc, nạp qua web, mã truy cập, leo thư mục, chặn trang lạ gửi lệnh,</w:t>
+        <w:t xml:space="preserve">bash test-web.sh       # 67 trường hợp: lõi Bát Quái đúng Kinh Dịch, thư viện, việc, nạp qua web, mã truy cập, leo thư mục, chặn trang lạ gửi lệnh,</w:t>
       </w:r>
     </w:p>
     <w:p>
@@ -21462,7 +21462,7 @@
       <w:r>
         <w:t xml:space="preserve"> </w:t>
       </w:r>
-      <w:hyperlink w:history="1" r:id="rIdhmlw-wctpec4g3wgwhjzi">
+      <w:hyperlink w:history="1" r:id="rIdcy67qtn3wsiziujwdjmyk">
         <w:r>
           <w:rPr>
             <w:b/>
@@ -45719,7 +45719,7 @@
       <w:r>
         <w:t xml:space="preserve"> </w:t>
       </w:r>
-      <w:hyperlink w:history="1" r:id="rId0j_cx87oqrdwyu-qlonm0">
+      <w:hyperlink w:history="1" r:id="rIdt252wbipmfrr--zjem7fd">
         <w:r>
           <w:rPr>
             <w:b/>

</xml_diff>